<commit_message>
Apply author-confirmed data and clear placeholders
All four outstanding values confirmed by the author, applied to both the
full five-case manuscript and the EJP brief report.

- Case 4 follow-up confirmed at 13 months; highlighting removed
- Patient 5 preoperative platelet count confirmed normal; Table 1 now
  reads "PC normal" in place of the blank
- Patient 5 postoperative dipyridamole confirmed; highlighting removed
- Ethics approval supplemented to cover Patient 5

Only the Fig. 11/12 legend placeholders remain highlighted in the
five-case version, pending the Patient 5 images.

Co-Authored-By: Claude Opus 5 <noreply@anthropic.com>
Claude-Session: https://claude.ai/code/session_01FRD7etKqYN8v2bbXeeLMRW
</commit_message>
<xml_diff>
--- a/Wandering spleen in children - EJP brief report.docx
+++ b/Wandering spleen in children - EJP brief report.docx
@@ -325,55 +325,21 @@
           <w:sz w:val="22"/>
           <w:szCs w:val="22"/>
         </w:rPr>
-        <w:t xml:space="preserve">Case 4, a boy of 2 years and 9 months, presented with gastric volvulus and antral perforation complicating wandering spleen. After repair of the perforation the viable spleen was repositioned and fixed by the reinforced two-pole technique (Fig. 1). Absorbable haemostatic gauze was laid on the visceral and diaphragmatic surfaces of the upper pole, and a 2-0 non-absorbable silk suture was passed through the gauze and the full thickness of the parenchyma, through the diaphragmatic muscle, and back through the parenchyma to be tied on the visceral side; the lower pole was secured to the lateral abdominal wall in the same way. He remains asymptomatic with a normally sited spleen at </w:t>
-      </w:r>
-      <w:r>
-        <w:rPr>
-          <w:rFonts w:ascii="Times New Roman" w:cs="Times New Roman" w:eastAsia="Times New Roman" w:hAnsi="Times New Roman"/>
-          <w:sz w:val="22"/>
-          <w:szCs w:val="22"/>
-          <w:highlight w:val="yellow"/>
-        </w:rPr>
-        <w:t xml:space="preserve">13</w:t>
-      </w:r>
-      <w:r>
-        <w:rPr>
-          <w:rFonts w:ascii="Times New Roman" w:cs="Times New Roman" w:eastAsia="Times New Roman" w:hAnsi="Times New Roman"/>
-          <w:sz w:val="22"/>
-          <w:szCs w:val="22"/>
-        </w:rPr>
-        <w:t xml:space="preserve"> months.</w:t>
-      </w:r>
-    </w:p>
-    <w:p>
-      <w:pPr>
-        <w:spacing w:after="120" w:line="360"/>
-        <w:jc w:val="both"/>
-      </w:pPr>
-      <w:r>
-        <w:rPr>
-          <w:rFonts w:ascii="Times New Roman" w:cs="Times New Roman" w:eastAsia="Times New Roman" w:hAnsi="Times New Roman"/>
-          <w:sz w:val="22"/>
-          <w:szCs w:val="22"/>
-        </w:rPr>
-        <w:t xml:space="preserve">All four children who underwent total splenectomy developed postoperative thrombocytosis, peaking at 918 × 10⁹/L in Case 5, </w:t>
-      </w:r>
-      <w:r>
-        <w:rPr>
-          <w:rFonts w:ascii="Times New Roman" w:cs="Times New Roman" w:eastAsia="Times New Roman" w:hAnsi="Times New Roman"/>
-          <w:sz w:val="22"/>
-          <w:szCs w:val="22"/>
-          <w:highlight w:val="yellow"/>
-        </w:rPr>
-        <w:t xml:space="preserve">which normalised on oral dipyridamole</w:t>
-      </w:r>
-      <w:r>
-        <w:rPr>
-          <w:rFonts w:ascii="Times New Roman" w:cs="Times New Roman" w:eastAsia="Times New Roman" w:hAnsi="Times New Roman"/>
-          <w:sz w:val="22"/>
-          <w:szCs w:val="22"/>
-        </w:rPr>
-        <w:t xml:space="preserve">. None developed overwhelming post-splenectomy infection, thromboembolism or pulmonary hypertension. Preoperative thrombocytosis preceded splenectomy in Cases 1 and 2, and platelet counts were normal at every encounter in which the spleen remained viable; Case 5, however, had established necrosis with a normal preoperative platelet count.</w:t>
+        <w:t xml:space="preserve">Case 4, a boy of 2 years and 9 months, presented with gastric volvulus and antral perforation complicating wandering spleen. After repair of the perforation the viable spleen was repositioned and fixed by the reinforced two-pole technique (Fig. 1). Absorbable haemostatic gauze was laid on the visceral and diaphragmatic surfaces of the upper pole, and a 2-0 non-absorbable silk suture was passed through the gauze and the full thickness of the parenchyma, through the diaphragmatic muscle, and back through the parenchyma to be tied on the visceral side; the lower pole was secured to the lateral abdominal wall in the same way. He remains asymptomatic with a normally sited spleen at 13 months.</w:t>
+      </w:r>
+    </w:p>
+    <w:p>
+      <w:pPr>
+        <w:spacing w:after="120" w:line="360"/>
+        <w:jc w:val="both"/>
+      </w:pPr>
+      <w:r>
+        <w:rPr>
+          <w:rFonts w:ascii="Times New Roman" w:cs="Times New Roman" w:eastAsia="Times New Roman" w:hAnsi="Times New Roman"/>
+          <w:sz w:val="22"/>
+          <w:szCs w:val="22"/>
+        </w:rPr>
+        <w:t xml:space="preserve">All four children who underwent total splenectomy developed postoperative thrombocytosis, peaking at 918 × 10⁹/L in Case 5, which normalised on oral dipyridamole. None developed overwhelming post-splenectomy infection, thromboembolism or pulmonary hypertension. Preoperative thrombocytosis preceded splenectomy in Cases 1 and 2, and platelet counts were normal at every encounter in which the spleen remained viable; Case 5, however, had established necrosis with a normal preoperative platelet count.</w:t>
       </w:r>
     </w:p>
     <w:p>
@@ -458,24 +424,7 @@
           <w:sz w:val="22"/>
           <w:szCs w:val="22"/>
         </w:rPr>
-        <w:t xml:space="preserve">These observations must be read against an obvious limitation: the technique was used in one patient followed for </w:t>
-      </w:r>
-      <w:r>
-        <w:rPr>
-          <w:rFonts w:ascii="Times New Roman" w:cs="Times New Roman" w:eastAsia="Times New Roman" w:hAnsi="Times New Roman"/>
-          <w:sz w:val="22"/>
-          <w:szCs w:val="22"/>
-          <w:highlight w:val="yellow"/>
-        </w:rPr>
-        <w:t xml:space="preserve">13</w:t>
-      </w:r>
-      <w:r>
-        <w:rPr>
-          <w:rFonts w:ascii="Times New Roman" w:cs="Times New Roman" w:eastAsia="Times New Roman" w:hAnsi="Times New Roman"/>
-          <w:sz w:val="22"/>
-          <w:szCs w:val="22"/>
-        </w:rPr>
-        <w:t xml:space="preserve"> months, and this is a preliminary technical description rather than a validated standard. The series is small, retrospective and single-centre, and the child in whom the technique succeeded had a spleen of normal size (8.4 × 3.7 cm), whereas the giant spleen of Case 3 is precisely the circumstance in which fixation is most demanding; whether the technique holds in that setting is untested [12]. Multicentre collection with longer follow-up is required.</w:t>
+        <w:t xml:space="preserve">These observations must be read against an obvious limitation: the technique was used in one patient followed for 13 months, and this is a preliminary technical description rather than a validated standard. The series is small, retrospective and single-centre, and the child in whom the technique succeeded had a spleen of normal size (8.4 × 3.7 cm), whereas the giant spleen of Case 3 is precisely the circumstance in which fixation is most demanding; whether the technique holds in that setting is untested [12]. Multicentre collection with longer follow-up is required.</w:t>
       </w:r>
     </w:p>
     <w:p>
@@ -1342,24 +1291,7 @@
                 <w:sz w:val="16"/>
                 <w:szCs w:val="16"/>
               </w:rPr>
-              <w:t xml:space="preserve">Spleen preserved; well at </w:t>
-            </w:r>
-            <w:r>
-              <w:rPr>
-                <w:rFonts w:ascii="Times New Roman" w:cs="Times New Roman" w:eastAsia="Times New Roman" w:hAnsi="Times New Roman"/>
-                <w:sz w:val="16"/>
-                <w:szCs w:val="16"/>
-                <w:highlight w:val="yellow"/>
-              </w:rPr>
-              <w:t xml:space="preserve">13</w:t>
-            </w:r>
-            <w:r>
-              <w:rPr>
-                <w:rFonts w:ascii="Times New Roman" w:cs="Times New Roman" w:eastAsia="Times New Roman" w:hAnsi="Times New Roman"/>
-                <w:sz w:val="16"/>
-                <w:szCs w:val="16"/>
-              </w:rPr>
-              <w:t xml:space="preserve"> months</w:t>
+              <w:t xml:space="preserve">Spleen preserved; well at 13 months</w:t>
             </w:r>
           </w:p>
         </w:tc>
@@ -1461,24 +1393,7 @@
                 <w:sz w:val="16"/>
                 <w:szCs w:val="16"/>
               </w:rPr>
-              <w:t xml:space="preserve">CT: whirl sign, splenic necrosis; pedicle torsion 720° at operation. PC </w:t>
-            </w:r>
-            <w:r>
-              <w:rPr>
-                <w:rFonts w:ascii="Times New Roman" w:cs="Times New Roman" w:eastAsia="Times New Roman" w:hAnsi="Times New Roman"/>
-                <w:sz w:val="16"/>
-                <w:szCs w:val="16"/>
-                <w:highlight w:val="yellow"/>
-              </w:rPr>
-              <w:t xml:space="preserve">___</w:t>
-            </w:r>
-            <w:r>
-              <w:rPr>
-                <w:rFonts w:ascii="Times New Roman" w:cs="Times New Roman" w:eastAsia="Times New Roman" w:hAnsi="Times New Roman"/>
-                <w:sz w:val="16"/>
-                <w:szCs w:val="16"/>
-              </w:rPr>
-              <w:t xml:space="preserve"> ×10⁹/L (normal)</w:t>
+              <w:t xml:space="preserve">CT: whirl sign, splenic necrosis; pedicle torsion 720° at operation. PC normal</w:t>
             </w:r>
           </w:p>
         </w:tc>

</xml_diff>